<commit_message>
Update curriculo.docx and add update script
</commit_message>
<xml_diff>
--- a/assets/curriculo.docx
+++ b/assets/curriculo.docx
@@ -288,6 +288,252 @@
           <w:sz w:val="22"/>
           <w:shd w:fill="auto" w:val="clear"/>
         </w:rPr>
+        <w:t xml:space="preserve">Supernosso </w:t>
+      </w:r>
+      <w:r>
+        <w:rPr>
+          <w:rFonts w:ascii="Cambria" w:hAnsi="Cambria" w:cs="Cambria" w:eastAsia="Cambria"/>
+          <w:color w:val="auto"/>
+          <w:spacing w:val="0"/>
+          <w:position w:val="0"/>
+          <w:sz w:val="22"/>
+          <w:shd w:fill="auto" w:val="clear"/>
+        </w:rPr>
+        <w:t xml:space="preserve">–</w:t>
+      </w:r>
+      <w:r>
+        <w:rPr>
+          <w:rFonts w:ascii="Cambria" w:hAnsi="Cambria" w:cs="Cambria" w:eastAsia="Cambria"/>
+          <w:color w:val="auto"/>
+          <w:spacing w:val="0"/>
+          <w:position w:val="0"/>
+          <w:sz w:val="22"/>
+          <w:shd w:fill="auto" w:val="clear"/>
+        </w:rPr>
+        <w:t xml:space="preserve"> Belo Horizonte/MG</w:t>
+      </w:r>
+    </w:p>
+    <w:p>
+      <w:pPr>
+        <w:spacing w:before="0" w:after="200" w:line="276"/>
+        <w:ind w:right="0" w:left="0" w:firstLine="0"/>
+        <w:jc w:val="left"/>
+        <w:rPr>
+          <w:rFonts w:ascii="Cambria" w:hAnsi="Cambria" w:cs="Cambria" w:eastAsia="Cambria"/>
+          <w:color w:val="auto"/>
+          <w:spacing w:val="0"/>
+          <w:position w:val="0"/>
+          <w:sz w:val="22"/>
+          <w:shd w:fill="auto" w:val="clear"/>
+        </w:rPr>
+      </w:pPr>
+      <w:r>
+        <w:rPr>
+          <w:rFonts w:ascii="Cambria" w:hAnsi="Cambria" w:cs="Cambria" w:eastAsia="Cambria"/>
+          <w:color w:val="auto"/>
+          <w:spacing w:val="0"/>
+          <w:position w:val="0"/>
+          <w:sz w:val="22"/>
+          <w:shd w:fill="auto" w:val="clear"/>
+        </w:rPr>
+        <w:t xml:space="preserve">Jovem Aprendiz Administrativo </w:t>
+      </w:r>
+      <w:r>
+        <w:rPr>
+          <w:rFonts w:ascii="Cambria" w:hAnsi="Cambria" w:cs="Cambria" w:eastAsia="Cambria"/>
+          <w:color w:val="auto"/>
+          <w:spacing w:val="0"/>
+          <w:position w:val="0"/>
+          <w:sz w:val="22"/>
+          <w:shd w:fill="auto" w:val="clear"/>
+        </w:rPr>
+        <w:t xml:space="preserve">–</w:t>
+      </w:r>
+      <w:r>
+        <w:rPr>
+          <w:rFonts w:ascii="Cambria" w:hAnsi="Cambria" w:cs="Cambria" w:eastAsia="Cambria"/>
+          <w:color w:val="auto"/>
+          <w:spacing w:val="0"/>
+          <w:position w:val="0"/>
+          <w:sz w:val="22"/>
+          <w:shd w:fill="auto" w:val="clear"/>
+        </w:rPr>
+        <w:t xml:space="preserve"> Atual</w:t>
+      </w:r>
+    </w:p>
+    <w:p>
+      <w:pPr>
+        <w:numPr>
+          <w:ilvl w:val="0"/>
+          <w:numId w:val="5"/>
+        </w:numPr>
+        <w:tabs>
+          <w:tab w:val="left" w:pos="360" w:leader="none"/>
+        </w:tabs>
+        <w:spacing w:before="0" w:after="200" w:line="276"/>
+        <w:ind w:right="0" w:left="360" w:hanging="360"/>
+        <w:jc w:val="left"/>
+        <w:rPr>
+          <w:rFonts w:ascii="Cambria" w:hAnsi="Cambria" w:cs="Cambria" w:eastAsia="Cambria"/>
+          <w:color w:val="auto"/>
+          <w:spacing w:val="0"/>
+          <w:position w:val="0"/>
+          <w:sz w:val="22"/>
+          <w:shd w:fill="auto" w:val="clear"/>
+        </w:rPr>
+      </w:pPr>
+      <w:r>
+        <w:rPr>
+          <w:rFonts w:ascii="Cambria" w:hAnsi="Cambria" w:cs="Cambria" w:eastAsia="Cambria"/>
+          <w:color w:val="auto"/>
+          <w:spacing w:val="0"/>
+          <w:position w:val="0"/>
+          <w:sz w:val="22"/>
+          <w:shd w:fill="auto" w:val="clear"/>
+        </w:rPr>
+        <w:t xml:space="preserve">Desenvolvimento de habilidades organizacionais e trabalho em equipe</w:t>
+      </w:r>
+    </w:p>
+    <w:p>
+      <w:pPr>
+        <w:numPr>
+          <w:ilvl w:val="0"/>
+          <w:numId w:val="5"/>
+        </w:numPr>
+        <w:tabs>
+          <w:tab w:val="left" w:pos="360" w:leader="none"/>
+        </w:tabs>
+        <w:spacing w:before="0" w:after="200" w:line="276"/>
+        <w:ind w:right="0" w:left="360" w:hanging="360"/>
+        <w:jc w:val="left"/>
+        <w:rPr>
+          <w:rFonts w:ascii="Cambria" w:hAnsi="Cambria" w:cs="Cambria" w:eastAsia="Cambria"/>
+          <w:color w:val="auto"/>
+          <w:spacing w:val="0"/>
+          <w:position w:val="0"/>
+          <w:sz w:val="22"/>
+          <w:shd w:fill="auto" w:val="clear"/>
+        </w:rPr>
+      </w:pPr>
+      <w:r>
+        <w:rPr>
+          <w:rFonts w:ascii="Cambria" w:hAnsi="Cambria" w:cs="Cambria" w:eastAsia="Cambria"/>
+          <w:color w:val="auto"/>
+          <w:spacing w:val="0"/>
+          <w:position w:val="0"/>
+          <w:sz w:val="22"/>
+          <w:shd w:fill="auto" w:val="clear"/>
+        </w:rPr>
+        <w:t xml:space="preserve">Organização de documentos e controle de informações</w:t>
+      </w:r>
+    </w:p>
+    <w:p>
+      <w:pPr>
+        <w:numPr>
+          <w:ilvl w:val="0"/>
+          <w:numId w:val="5"/>
+        </w:numPr>
+        <w:tabs>
+          <w:tab w:val="left" w:pos="360" w:leader="none"/>
+        </w:tabs>
+        <w:spacing w:before="0" w:after="200" w:line="276"/>
+        <w:ind w:right="0" w:left="360" w:hanging="360"/>
+        <w:jc w:val="left"/>
+        <w:rPr>
+          <w:rFonts w:ascii="Cambria" w:hAnsi="Cambria" w:cs="Cambria" w:eastAsia="Cambria"/>
+          <w:color w:val="auto"/>
+          <w:spacing w:val="0"/>
+          <w:position w:val="0"/>
+          <w:sz w:val="22"/>
+          <w:shd w:fill="auto" w:val="clear"/>
+        </w:rPr>
+      </w:pPr>
+      <w:r>
+        <w:rPr>
+          <w:rFonts w:ascii="Cambria" w:hAnsi="Cambria" w:cs="Cambria" w:eastAsia="Cambria"/>
+          <w:color w:val="auto"/>
+          <w:spacing w:val="0"/>
+          <w:position w:val="0"/>
+          <w:sz w:val="22"/>
+          <w:shd w:fill="auto" w:val="clear"/>
+        </w:rPr>
+        <w:t xml:space="preserve">Auxílio em atividades internas do setor</w:t>
+      </w:r>
+    </w:p>
+    <w:p>
+      <w:pPr>
+        <w:numPr>
+          <w:ilvl w:val="0"/>
+          <w:numId w:val="5"/>
+        </w:numPr>
+        <w:tabs>
+          <w:tab w:val="left" w:pos="360" w:leader="none"/>
+        </w:tabs>
+        <w:spacing w:before="0" w:after="200" w:line="276"/>
+        <w:ind w:right="0" w:left="360" w:hanging="360"/>
+        <w:jc w:val="left"/>
+        <w:rPr>
+          <w:rFonts w:ascii="Cambria" w:hAnsi="Cambria" w:cs="Cambria" w:eastAsia="Cambria"/>
+          <w:color w:val="auto"/>
+          <w:spacing w:val="0"/>
+          <w:position w:val="0"/>
+          <w:sz w:val="22"/>
+          <w:shd w:fill="auto" w:val="clear"/>
+        </w:rPr>
+      </w:pPr>
+      <w:r>
+        <w:rPr>
+          <w:rFonts w:ascii="Cambria" w:hAnsi="Cambria" w:cs="Cambria" w:eastAsia="Cambria"/>
+          <w:color w:val="auto"/>
+          <w:spacing w:val="0"/>
+          <w:position w:val="0"/>
+          <w:sz w:val="22"/>
+          <w:shd w:fill="auto" w:val="clear"/>
+        </w:rPr>
+        <w:t xml:space="preserve">Apoio nas rotinas administrativas</w:t>
+      </w:r>
+    </w:p>
+    <w:p>
+      <w:pPr>
+        <w:tabs>
+          <w:tab w:val="left" w:pos="360" w:leader="none"/>
+        </w:tabs>
+        <w:spacing w:before="0" w:after="200" w:line="276"/>
+        <w:ind w:right="0" w:left="0" w:firstLine="0"/>
+        <w:jc w:val="left"/>
+        <w:rPr>
+          <w:rFonts w:ascii="Cambria" w:hAnsi="Cambria" w:cs="Cambria" w:eastAsia="Cambria"/>
+          <w:color w:val="auto"/>
+          <w:spacing w:val="0"/>
+          <w:position w:val="0"/>
+          <w:sz w:val="22"/>
+          <w:shd w:fill="auto" w:val="clear"/>
+        </w:rPr>
+      </w:pPr>
+    </w:p>
+    <w:p>
+      <w:pPr>
+        <w:spacing w:before="0" w:after="200" w:line="276"/>
+        <w:ind w:right="0" w:left="0" w:firstLine="0"/>
+        <w:jc w:val="left"/>
+        <w:rPr>
+          <w:rFonts w:ascii="Cambria" w:hAnsi="Cambria" w:cs="Cambria" w:eastAsia="Cambria"/>
+          <w:color w:val="auto"/>
+          <w:spacing w:val="0"/>
+          <w:position w:val="0"/>
+          <w:sz w:val="22"/>
+          <w:shd w:fill="auto" w:val="clear"/>
+        </w:rPr>
+      </w:pPr>
+      <w:r>
+        <w:rPr>
+          <w:rFonts w:ascii="Cambria" w:hAnsi="Cambria" w:cs="Cambria" w:eastAsia="Cambria"/>
+          <w:color w:val="auto"/>
+          <w:spacing w:val="0"/>
+          <w:position w:val="0"/>
+          <w:sz w:val="22"/>
+          <w:shd w:fill="auto" w:val="clear"/>
+        </w:rPr>
         <w:t xml:space="preserve">Supermercado São Pascoal </w:t>
       </w:r>
       <w:r>
@@ -343,7 +589,7 @@
       <w:pPr>
         <w:numPr>
           <w:ilvl w:val="0"/>
-          <w:numId w:val="5"/>
+          <w:numId w:val="8"/>
         </w:numPr>
         <w:tabs>
           <w:tab w:val="left" w:pos="360" w:leader="none"/>
@@ -376,7 +622,7 @@
       <w:pPr>
         <w:numPr>
           <w:ilvl w:val="0"/>
-          <w:numId w:val="5"/>
+          <w:numId w:val="8"/>
         </w:numPr>
         <w:tabs>
           <w:tab w:val="left" w:pos="360" w:leader="none"/>
@@ -409,7 +655,7 @@
       <w:pPr>
         <w:numPr>
           <w:ilvl w:val="0"/>
-          <w:numId w:val="5"/>
+          <w:numId w:val="8"/>
         </w:numPr>
         <w:tabs>
           <w:tab w:val="left" w:pos="360" w:leader="none"/>
@@ -442,7 +688,7 @@
       <w:pPr>
         <w:numPr>
           <w:ilvl w:val="0"/>
-          <w:numId w:val="5"/>
+          <w:numId w:val="8"/>
         </w:numPr>
         <w:tabs>
           <w:tab w:val="left" w:pos="360" w:leader="none"/>
@@ -475,7 +721,7 @@
       <w:pPr>
         <w:numPr>
           <w:ilvl w:val="0"/>
-          <w:numId w:val="5"/>
+          <w:numId w:val="8"/>
         </w:numPr>
         <w:tabs>
           <w:tab w:val="left" w:pos="360" w:leader="none"/>
@@ -506,231 +752,21 @@
     </w:p>
     <w:p>
       <w:pPr>
-        <w:spacing w:before="0" w:after="200" w:line="276"/>
-        <w:ind w:right="0" w:left="0" w:firstLine="0"/>
-        <w:jc w:val="left"/>
-        <w:rPr>
-          <w:rFonts w:ascii="Cambria" w:hAnsi="Cambria" w:cs="Cambria" w:eastAsia="Cambria"/>
-          <w:color w:val="auto"/>
-          <w:spacing w:val="0"/>
-          <w:position w:val="0"/>
-          <w:sz w:val="22"/>
-          <w:shd w:fill="auto" w:val="clear"/>
-        </w:rPr>
-      </w:pPr>
-      <w:r>
-        <w:rPr>
-          <w:rFonts w:ascii="Cambria" w:hAnsi="Cambria" w:cs="Cambria" w:eastAsia="Cambria"/>
-          <w:color w:val="auto"/>
-          <w:spacing w:val="0"/>
-          <w:position w:val="0"/>
-          <w:sz w:val="22"/>
-          <w:shd w:fill="auto" w:val="clear"/>
-        </w:rPr>
-        <w:t xml:space="preserve">Supernosso </w:t>
-      </w:r>
-      <w:r>
-        <w:rPr>
-          <w:rFonts w:ascii="Cambria" w:hAnsi="Cambria" w:cs="Cambria" w:eastAsia="Cambria"/>
-          <w:color w:val="auto"/>
-          <w:spacing w:val="0"/>
-          <w:position w:val="0"/>
-          <w:sz w:val="22"/>
-          <w:shd w:fill="auto" w:val="clear"/>
-        </w:rPr>
-        <w:t xml:space="preserve">–</w:t>
-      </w:r>
-      <w:r>
-        <w:rPr>
-          <w:rFonts w:ascii="Cambria" w:hAnsi="Cambria" w:cs="Cambria" w:eastAsia="Cambria"/>
-          <w:color w:val="auto"/>
-          <w:spacing w:val="0"/>
-          <w:position w:val="0"/>
-          <w:sz w:val="22"/>
-          <w:shd w:fill="auto" w:val="clear"/>
-        </w:rPr>
-        <w:t xml:space="preserve"> Belo Horizonte/MG</w:t>
-      </w:r>
-    </w:p>
-    <w:p>
-      <w:pPr>
-        <w:spacing w:before="0" w:after="200" w:line="276"/>
-        <w:ind w:right="0" w:left="0" w:firstLine="0"/>
-        <w:jc w:val="left"/>
-        <w:rPr>
-          <w:rFonts w:ascii="Cambria" w:hAnsi="Cambria" w:cs="Cambria" w:eastAsia="Cambria"/>
-          <w:color w:val="auto"/>
-          <w:spacing w:val="0"/>
-          <w:position w:val="0"/>
-          <w:sz w:val="22"/>
-          <w:shd w:fill="auto" w:val="clear"/>
-        </w:rPr>
-      </w:pPr>
-      <w:r>
-        <w:rPr>
-          <w:rFonts w:ascii="Cambria" w:hAnsi="Cambria" w:cs="Cambria" w:eastAsia="Cambria"/>
-          <w:color w:val="auto"/>
-          <w:spacing w:val="0"/>
-          <w:position w:val="0"/>
-          <w:sz w:val="22"/>
-          <w:shd w:fill="auto" w:val="clear"/>
-        </w:rPr>
-        <w:t xml:space="preserve">Jovem Aprendiz Administrativo </w:t>
-      </w:r>
-      <w:r>
-        <w:rPr>
-          <w:rFonts w:ascii="Cambria" w:hAnsi="Cambria" w:cs="Cambria" w:eastAsia="Cambria"/>
-          <w:color w:val="auto"/>
-          <w:spacing w:val="0"/>
-          <w:position w:val="0"/>
-          <w:sz w:val="22"/>
-          <w:shd w:fill="auto" w:val="clear"/>
-        </w:rPr>
-        <w:t xml:space="preserve">–</w:t>
-      </w:r>
-      <w:r>
-        <w:rPr>
-          <w:rFonts w:ascii="Cambria" w:hAnsi="Cambria" w:cs="Cambria" w:eastAsia="Cambria"/>
-          <w:color w:val="auto"/>
-          <w:spacing w:val="0"/>
-          <w:position w:val="0"/>
-          <w:sz w:val="22"/>
-          <w:shd w:fill="auto" w:val="clear"/>
-        </w:rPr>
-        <w:t xml:space="preserve"> Atual</w:t>
-      </w:r>
-    </w:p>
-    <w:p>
-      <w:pPr>
-        <w:numPr>
-          <w:ilvl w:val="0"/>
-          <w:numId w:val="7"/>
-        </w:numPr>
-        <w:tabs>
-          <w:tab w:val="left" w:pos="360" w:leader="none"/>
-        </w:tabs>
-        <w:spacing w:before="0" w:after="200" w:line="276"/>
-        <w:ind w:right="0" w:left="360" w:hanging="360"/>
-        <w:jc w:val="left"/>
-        <w:rPr>
-          <w:rFonts w:ascii="Cambria" w:hAnsi="Cambria" w:cs="Cambria" w:eastAsia="Cambria"/>
-          <w:color w:val="auto"/>
-          <w:spacing w:val="0"/>
-          <w:position w:val="0"/>
-          <w:sz w:val="22"/>
-          <w:shd w:fill="auto" w:val="clear"/>
-        </w:rPr>
-      </w:pPr>
-      <w:r>
-        <w:rPr>
-          <w:rFonts w:ascii="Cambria" w:hAnsi="Cambria" w:cs="Cambria" w:eastAsia="Cambria"/>
-          <w:color w:val="auto"/>
-          <w:spacing w:val="0"/>
-          <w:position w:val="0"/>
-          <w:sz w:val="22"/>
-          <w:shd w:fill="auto" w:val="clear"/>
-        </w:rPr>
-        <w:t xml:space="preserve">Desenvolvimento de habilidades organizacionais e trabalho em equipe</w:t>
-      </w:r>
-    </w:p>
-    <w:p>
-      <w:pPr>
-        <w:numPr>
-          <w:ilvl w:val="0"/>
-          <w:numId w:val="7"/>
-        </w:numPr>
-        <w:tabs>
-          <w:tab w:val="left" w:pos="360" w:leader="none"/>
-        </w:tabs>
-        <w:spacing w:before="0" w:after="200" w:line="276"/>
-        <w:ind w:right="0" w:left="360" w:hanging="360"/>
-        <w:jc w:val="left"/>
-        <w:rPr>
-          <w:rFonts w:ascii="Cambria" w:hAnsi="Cambria" w:cs="Cambria" w:eastAsia="Cambria"/>
-          <w:color w:val="auto"/>
-          <w:spacing w:val="0"/>
-          <w:position w:val="0"/>
-          <w:sz w:val="22"/>
-          <w:shd w:fill="auto" w:val="clear"/>
-        </w:rPr>
-      </w:pPr>
-      <w:r>
-        <w:rPr>
-          <w:rFonts w:ascii="Cambria" w:hAnsi="Cambria" w:cs="Cambria" w:eastAsia="Cambria"/>
-          <w:color w:val="auto"/>
-          <w:spacing w:val="0"/>
-          <w:position w:val="0"/>
-          <w:sz w:val="22"/>
-          <w:shd w:fill="auto" w:val="clear"/>
-        </w:rPr>
-        <w:t xml:space="preserve">Organização de documentos e controle de informações</w:t>
-      </w:r>
-    </w:p>
-    <w:p>
-      <w:pPr>
-        <w:numPr>
-          <w:ilvl w:val="0"/>
-          <w:numId w:val="7"/>
-        </w:numPr>
-        <w:tabs>
-          <w:tab w:val="left" w:pos="360" w:leader="none"/>
-        </w:tabs>
-        <w:spacing w:before="0" w:after="200" w:line="276"/>
-        <w:ind w:right="0" w:left="360" w:hanging="360"/>
-        <w:jc w:val="left"/>
-        <w:rPr>
-          <w:rFonts w:ascii="Cambria" w:hAnsi="Cambria" w:cs="Cambria" w:eastAsia="Cambria"/>
-          <w:color w:val="auto"/>
-          <w:spacing w:val="0"/>
-          <w:position w:val="0"/>
-          <w:sz w:val="22"/>
-          <w:shd w:fill="auto" w:val="clear"/>
-        </w:rPr>
-      </w:pPr>
-      <w:r>
-        <w:rPr>
-          <w:rFonts w:ascii="Cambria" w:hAnsi="Cambria" w:cs="Cambria" w:eastAsia="Cambria"/>
-          <w:color w:val="auto"/>
-          <w:spacing w:val="0"/>
-          <w:position w:val="0"/>
-          <w:sz w:val="22"/>
-          <w:shd w:fill="auto" w:val="clear"/>
-        </w:rPr>
-        <w:t xml:space="preserve">Auxílio em atividades internas do setor</w:t>
-      </w:r>
-    </w:p>
-    <w:p>
-      <w:pPr>
-        <w:numPr>
-          <w:ilvl w:val="0"/>
-          <w:numId w:val="7"/>
-        </w:numPr>
-        <w:tabs>
-          <w:tab w:val="left" w:pos="360" w:leader="none"/>
-        </w:tabs>
-        <w:spacing w:before="0" w:after="200" w:line="276"/>
-        <w:ind w:right="0" w:left="360" w:hanging="360"/>
-        <w:jc w:val="left"/>
-        <w:rPr>
-          <w:rFonts w:ascii="Cambria" w:hAnsi="Cambria" w:cs="Cambria" w:eastAsia="Cambria"/>
-          <w:color w:val="auto"/>
-          <w:spacing w:val="0"/>
-          <w:position w:val="0"/>
-          <w:sz w:val="22"/>
-          <w:shd w:fill="auto" w:val="clear"/>
-        </w:rPr>
-      </w:pPr>
-      <w:r>
-        <w:rPr>
-          <w:rFonts w:ascii="Cambria" w:hAnsi="Cambria" w:cs="Cambria" w:eastAsia="Cambria"/>
-          <w:color w:val="auto"/>
-          <w:spacing w:val="0"/>
-          <w:position w:val="0"/>
-          <w:sz w:val="22"/>
-          <w:shd w:fill="auto" w:val="clear"/>
-        </w:rPr>
-        <w:t xml:space="preserve">Apoio nas rotinas administrativas</w:t>
-      </w:r>
+        <w:tabs>
+          <w:tab w:val="left" w:pos="360" w:leader="none"/>
+        </w:tabs>
+        <w:spacing w:before="0" w:after="200" w:line="276"/>
+        <w:ind w:right="0" w:left="0" w:firstLine="0"/>
+        <w:jc w:val="left"/>
+        <w:rPr>
+          <w:rFonts w:ascii="Cambria" w:hAnsi="Cambria" w:cs="Cambria" w:eastAsia="Cambria"/>
+          <w:color w:val="auto"/>
+          <w:spacing w:val="0"/>
+          <w:position w:val="0"/>
+          <w:sz w:val="22"/>
+          <w:shd w:fill="auto" w:val="clear"/>
+        </w:rPr>
+      </w:pPr>
     </w:p>
     <w:p>
       <w:pPr>
@@ -763,7 +799,7 @@
       <w:pPr>
         <w:numPr>
           <w:ilvl w:val="0"/>
-          <w:numId w:val="9"/>
+          <w:numId w:val="11"/>
         </w:numPr>
         <w:tabs>
           <w:tab w:val="left" w:pos="360" w:leader="none"/>
@@ -796,73 +832,131 @@
       <w:pPr>
         <w:numPr>
           <w:ilvl w:val="0"/>
-          <w:numId w:val="9"/>
-        </w:numPr>
-        <w:tabs>
-          <w:tab w:val="left" w:pos="360" w:leader="none"/>
-        </w:tabs>
-        <w:spacing w:before="0" w:after="200" w:line="276"/>
-        <w:ind w:right="0" w:left="360" w:hanging="360"/>
-        <w:jc w:val="left"/>
-        <w:rPr>
-          <w:rFonts w:ascii="Cambria" w:hAnsi="Cambria" w:cs="Cambria" w:eastAsia="Cambria"/>
-          <w:color w:val="auto"/>
-          <w:spacing w:val="0"/>
-          <w:position w:val="0"/>
-          <w:sz w:val="22"/>
-          <w:shd w:fill="auto" w:val="clear"/>
-        </w:rPr>
-      </w:pPr>
-      <w:r>
-        <w:rPr>
-          <w:rFonts w:ascii="Cambria" w:hAnsi="Cambria" w:cs="Cambria" w:eastAsia="Cambria"/>
-          <w:color w:val="auto"/>
-          <w:spacing w:val="0"/>
-          <w:position w:val="0"/>
-          <w:sz w:val="22"/>
-          <w:shd w:fill="auto" w:val="clear"/>
-        </w:rPr>
-        <w:t xml:space="preserve">UniONG(https://github.com/JoaoVictorPe/UniONG)</w:t>
-      </w:r>
-    </w:p>
-    <w:p>
-      <w:pPr>
-        <w:numPr>
-          <w:ilvl w:val="0"/>
-          <w:numId w:val="9"/>
-        </w:numPr>
-        <w:tabs>
-          <w:tab w:val="left" w:pos="360" w:leader="none"/>
-        </w:tabs>
-        <w:spacing w:before="0" w:after="200" w:line="276"/>
-        <w:ind w:right="0" w:left="360" w:hanging="360"/>
-        <w:jc w:val="left"/>
-        <w:rPr>
-          <w:rFonts w:ascii="Cambria" w:hAnsi="Cambria" w:cs="Cambria" w:eastAsia="Cambria"/>
-          <w:color w:val="auto"/>
-          <w:spacing w:val="0"/>
-          <w:position w:val="0"/>
-          <w:sz w:val="22"/>
-          <w:shd w:fill="auto" w:val="clear"/>
-        </w:rPr>
-      </w:pPr>
-      <w:r>
-        <w:rPr>
-          <w:rFonts w:ascii="Cambria" w:hAnsi="Cambria" w:cs="Cambria" w:eastAsia="Cambria"/>
-          <w:color w:val="auto"/>
-          <w:spacing w:val="0"/>
-          <w:position w:val="0"/>
-          <w:sz w:val="22"/>
-          <w:shd w:fill="auto" w:val="clear"/>
-        </w:rPr>
-        <w:t xml:space="preserve">Curriculo Interativo(https://JoaoVictorPe.github.io/Curriculnterativo/)</w:t>
-      </w:r>
-    </w:p>
-    <w:p>
-      <w:pPr>
-        <w:numPr>
-          <w:ilvl w:val="0"/>
-          <w:numId w:val="9"/>
+          <w:numId w:val="11"/>
+        </w:numPr>
+        <w:tabs>
+          <w:tab w:val="left" w:pos="360" w:leader="none"/>
+        </w:tabs>
+        <w:spacing w:before="0" w:after="200" w:line="276"/>
+        <w:ind w:right="0" w:left="360" w:hanging="360"/>
+        <w:jc w:val="left"/>
+        <w:rPr>
+          <w:rFonts w:ascii="Cambria" w:hAnsi="Cambria" w:cs="Cambria" w:eastAsia="Cambria"/>
+          <w:color w:val="auto"/>
+          <w:spacing w:val="0"/>
+          <w:position w:val="0"/>
+          <w:sz w:val="22"/>
+          <w:shd w:fill="auto" w:val="clear"/>
+        </w:rPr>
+      </w:pPr>
+      <w:r>
+        <w:rPr>
+          <w:rFonts w:ascii="Cambria" w:hAnsi="Cambria" w:cs="Cambria" w:eastAsia="Cambria"/>
+          <w:color w:val="auto"/>
+          <w:spacing w:val="0"/>
+          <w:position w:val="0"/>
+          <w:sz w:val="22"/>
+          <w:shd w:fill="auto" w:val="clear"/>
+        </w:rPr>
+        <w:t xml:space="preserve">UniONG(https://joaovictorpe.github.io/UniONG/)</w:t>
+      </w:r>
+    </w:p>
+    <w:p>
+      <w:pPr>
+        <w:numPr>
+          <w:ilvl w:val="0"/>
+          <w:numId w:val="11"/>
+        </w:numPr>
+        <w:tabs>
+          <w:tab w:val="left" w:pos="360" w:leader="none"/>
+        </w:tabs>
+        <w:spacing w:before="0" w:after="200" w:line="276"/>
+        <w:ind w:right="0" w:left="360" w:hanging="360"/>
+        <w:jc w:val="left"/>
+        <w:rPr>
+          <w:rFonts w:ascii="Cambria" w:hAnsi="Cambria" w:cs="Cambria" w:eastAsia="Cambria"/>
+          <w:color w:val="auto"/>
+          <w:spacing w:val="0"/>
+          <w:position w:val="0"/>
+          <w:sz w:val="22"/>
+          <w:shd w:fill="auto" w:val="clear"/>
+        </w:rPr>
+      </w:pPr>
+      <w:r>
+        <w:rPr>
+          <w:rFonts w:ascii="Cambria" w:hAnsi="Cambria" w:cs="Cambria" w:eastAsia="Cambria"/>
+          <w:color w:val="auto"/>
+          <w:spacing w:val="0"/>
+          <w:position w:val="0"/>
+          <w:sz w:val="22"/>
+          <w:shd w:fill="auto" w:val="clear"/>
+        </w:rPr>
+        <w:t xml:space="preserve">Curriculo Interativo( </w:t>
+      </w:r>
+      <w:hyperlink xmlns:r="http://schemas.openxmlformats.org/officeDocument/2006/relationships" r:id="docRId0">
+        <w:r>
+          <w:rPr>
+            <w:rFonts w:ascii="Cambria" w:hAnsi="Cambria" w:cs="Cambria" w:eastAsia="Cambria"/>
+            <w:color w:val="0000FF"/>
+            <w:spacing w:val="0"/>
+            <w:position w:val="0"/>
+            <w:sz w:val="22"/>
+            <w:u w:val="single"/>
+            <w:shd w:fill="auto" w:val="clear"/>
+          </w:rPr>
+          <w:t xml:space="preserve">https://joaovictorpe.github.io/Curriculnterativo/</w:t>
+        </w:r>
+      </w:hyperlink>
+      <w:r>
+        <w:rPr>
+          <w:rFonts w:ascii="Cambria" w:hAnsi="Cambria" w:cs="Cambria" w:eastAsia="Cambria"/>
+          <w:color w:val="auto"/>
+          <w:spacing w:val="0"/>
+          <w:position w:val="0"/>
+          <w:sz w:val="22"/>
+          <w:shd w:fill="auto" w:val="clear"/>
+        </w:rPr>
+        <w:t xml:space="preserve">)</w:t>
+      </w:r>
+    </w:p>
+    <w:p>
+      <w:pPr>
+        <w:numPr>
+          <w:ilvl w:val="0"/>
+          <w:numId w:val="11"/>
+        </w:numPr>
+        <w:tabs>
+          <w:tab w:val="left" w:pos="360" w:leader="none"/>
+        </w:tabs>
+        <w:spacing w:before="0" w:after="200" w:line="276"/>
+        <w:ind w:right="0" w:left="360" w:hanging="360"/>
+        <w:jc w:val="left"/>
+        <w:rPr>
+          <w:rFonts w:ascii="Cambria" w:hAnsi="Cambria" w:cs="Cambria" w:eastAsia="Cambria"/>
+          <w:color w:val="auto"/>
+          <w:spacing w:val="0"/>
+          <w:position w:val="0"/>
+          <w:sz w:val="22"/>
+          <w:shd w:fill="auto" w:val="clear"/>
+        </w:rPr>
+      </w:pPr>
+      <w:r>
+        <w:rPr>
+          <w:rFonts w:ascii="Cambria" w:hAnsi="Cambria" w:cs="Cambria" w:eastAsia="Cambria"/>
+          <w:color w:val="auto"/>
+          <w:spacing w:val="0"/>
+          <w:position w:val="0"/>
+          <w:sz w:val="22"/>
+          <w:shd w:fill="auto" w:val="clear"/>
+        </w:rPr>
+        <w:t xml:space="preserve">Calculadora(https://joaovictorpe.github.io/Calculadora/)</w:t>
+      </w:r>
+    </w:p>
+    <w:p>
+      <w:pPr>
+        <w:numPr>
+          <w:ilvl w:val="0"/>
+          <w:numId w:val="11"/>
         </w:numPr>
         <w:tabs>
           <w:tab w:val="left" w:pos="360" w:leader="none"/>
@@ -895,7 +989,7 @@
       <w:pPr>
         <w:numPr>
           <w:ilvl w:val="0"/>
-          <w:numId w:val="9"/>
+          <w:numId w:val="11"/>
         </w:numPr>
         <w:tabs>
           <w:tab w:val="left" w:pos="360" w:leader="none"/>
@@ -928,7 +1022,7 @@
       <w:pPr>
         <w:numPr>
           <w:ilvl w:val="0"/>
-          <w:numId w:val="9"/>
+          <w:numId w:val="11"/>
         </w:numPr>
         <w:tabs>
           <w:tab w:val="left" w:pos="360" w:leader="none"/>
@@ -988,7 +1082,7 @@
       <w:pPr>
         <w:numPr>
           <w:ilvl w:val="0"/>
-          <w:numId w:val="11"/>
+          <w:numId w:val="13"/>
         </w:numPr>
         <w:tabs>
           <w:tab w:val="left" w:pos="360" w:leader="none"/>
@@ -1021,7 +1115,7 @@
       <w:pPr>
         <w:numPr>
           <w:ilvl w:val="0"/>
-          <w:numId w:val="11"/>
+          <w:numId w:val="13"/>
         </w:numPr>
         <w:tabs>
           <w:tab w:val="left" w:pos="360" w:leader="none"/>
@@ -1054,7 +1148,7 @@
       <w:pPr>
         <w:numPr>
           <w:ilvl w:val="0"/>
-          <w:numId w:val="11"/>
+          <w:numId w:val="13"/>
         </w:numPr>
         <w:tabs>
           <w:tab w:val="left" w:pos="360" w:leader="none"/>
@@ -1087,7 +1181,7 @@
       <w:pPr>
         <w:numPr>
           <w:ilvl w:val="0"/>
-          <w:numId w:val="11"/>
+          <w:numId w:val="13"/>
         </w:numPr>
         <w:tabs>
           <w:tab w:val="left" w:pos="360" w:leader="none"/>
@@ -1120,7 +1214,7 @@
       <w:pPr>
         <w:numPr>
           <w:ilvl w:val="0"/>
-          <w:numId w:val="11"/>
+          <w:numId w:val="13"/>
         </w:numPr>
         <w:tabs>
           <w:tab w:val="left" w:pos="360" w:leader="none"/>
@@ -1153,7 +1247,7 @@
       <w:pPr>
         <w:numPr>
           <w:ilvl w:val="0"/>
-          <w:numId w:val="11"/>
+          <w:numId w:val="13"/>
         </w:numPr>
         <w:tabs>
           <w:tab w:val="left" w:pos="360" w:leader="none"/>
@@ -1186,7 +1280,7 @@
       <w:pPr>
         <w:numPr>
           <w:ilvl w:val="0"/>
-          <w:numId w:val="11"/>
+          <w:numId w:val="13"/>
         </w:numPr>
         <w:tabs>
           <w:tab w:val="left" w:pos="360" w:leader="none"/>
@@ -1246,7 +1340,7 @@
       <w:pPr>
         <w:numPr>
           <w:ilvl w:val="0"/>
-          <w:numId w:val="13"/>
+          <w:numId w:val="15"/>
         </w:numPr>
         <w:tabs>
           <w:tab w:val="left" w:pos="360" w:leader="none"/>
@@ -1279,7 +1373,7 @@
       <w:pPr>
         <w:numPr>
           <w:ilvl w:val="0"/>
-          <w:numId w:val="13"/>
+          <w:numId w:val="15"/>
         </w:numPr>
         <w:tabs>
           <w:tab w:val="left" w:pos="360" w:leader="none"/>
@@ -1312,7 +1406,7 @@
       <w:pPr>
         <w:numPr>
           <w:ilvl w:val="0"/>
-          <w:numId w:val="13"/>
+          <w:numId w:val="15"/>
         </w:numPr>
         <w:tabs>
           <w:tab w:val="left" w:pos="360" w:leader="none"/>
@@ -1413,16 +1507,16 @@
   <w:num w:numId="5">
     <w:abstractNumId w:val="24"/>
   </w:num>
-  <w:num w:numId="7">
+  <w:num w:numId="8">
     <w:abstractNumId w:val="18"/>
   </w:num>
-  <w:num w:numId="9">
+  <w:num w:numId="11">
     <w:abstractNumId w:val="12"/>
   </w:num>
-  <w:num w:numId="11">
+  <w:num w:numId="13">
     <w:abstractNumId w:val="6"/>
   </w:num>
-  <w:num w:numId="13">
+  <w:num w:numId="15">
     <w:abstractNumId w:val="0"/>
   </w:num>
 </w:numbering>

</xml_diff>